<commit_message>
Replace generic prompt guidance with real examples
</commit_message>
<xml_diff>
--- a/Clinical Confidence Lab - Prompt Example Library.docx
+++ b/Clinical Confidence Lab - Prompt Example Library.docx
@@ -80,7 +80,799 @@
           <w:b/>
           <w:color w:val="2A3C2F"/>
         </w:rPr>
-        <w:t>01  Known or observable facts</w:t>
+        <w:t>01  The fantasy version of a confident therapist</w:t>
+      </w:r>
+    </w:p>
+    <w:p>
+      <w:pPr>
+        <w:spacing w:after="100"/>
+        <w:ind w:left="403"/>
+      </w:pPr>
+      <w:r>
+        <w:rPr>
+          <w:b/>
+          <w:color w:val="C56A4D"/>
+        </w:rPr>
+        <w:t xml:space="preserve">Example: </w:t>
+      </w:r>
+      <w:r>
+        <w:rPr>
+          <w:i/>
+          <w:color w:val="64735B"/>
+        </w:rPr>
+        <w:t>Calm, articulate, certain, never awkward, and always able to say something meaningful right away.</w:t>
+      </w:r>
+    </w:p>
+    <w:p>
+      <w:pPr>
+        <w:keepNext/>
+        <w:spacing w:before="160" w:after="40"/>
+      </w:pPr>
+      <w:r>
+        <w:rPr>
+          <w:b/>
+          <w:color w:val="2A3C2F"/>
+        </w:rPr>
+        <w:t>02  The trustworthy version I want to become</w:t>
+      </w:r>
+    </w:p>
+    <w:p>
+      <w:pPr>
+        <w:spacing w:after="100"/>
+        <w:ind w:left="403"/>
+      </w:pPr>
+      <w:r>
+        <w:rPr>
+          <w:b/>
+          <w:color w:val="C56A4D"/>
+        </w:rPr>
+        <w:t xml:space="preserve">Example: </w:t>
+      </w:r>
+      <w:r>
+        <w:rPr>
+          <w:i/>
+          <w:color w:val="64735B"/>
+        </w:rPr>
+        <w:t>I want to notice when I’m activated, slow down enough to think, and respond honestly instead of performing.</w:t>
+      </w:r>
+    </w:p>
+    <w:p>
+      <w:pPr>
+        <w:keepNext/>
+        <w:spacing w:before="160" w:after="40"/>
+      </w:pPr>
+      <w:r>
+        <w:rPr>
+          <w:b/>
+          <w:color w:val="2A3C2F"/>
+        </w:rPr>
+        <w:t>03  A confident clinician is not someone who…</w:t>
+      </w:r>
+    </w:p>
+    <w:p>
+      <w:pPr>
+        <w:spacing w:after="100"/>
+        <w:ind w:left="403"/>
+      </w:pPr>
+      <w:r>
+        <w:rPr>
+          <w:b/>
+          <w:color w:val="C56A4D"/>
+        </w:rPr>
+        <w:t xml:space="preserve">Example: </w:t>
+      </w:r>
+      <w:r>
+        <w:rPr>
+          <w:i/>
+          <w:color w:val="64735B"/>
+        </w:rPr>
+        <w:t>Never feels uncertain, always knows the perfect intervention, or makes every session feel profound.</w:t>
+      </w:r>
+    </w:p>
+    <w:p>
+      <w:pPr>
+        <w:keepNext/>
+        <w:spacing w:before="160" w:after="40"/>
+      </w:pPr>
+      <w:r>
+        <w:rPr>
+          <w:b/>
+          <w:color w:val="2A3C2F"/>
+        </w:rPr>
+        <w:t>04  A confident clinician is someone who…</w:t>
+      </w:r>
+    </w:p>
+    <w:p>
+      <w:pPr>
+        <w:spacing w:after="100"/>
+        <w:ind w:left="403"/>
+      </w:pPr>
+      <w:r>
+        <w:rPr>
+          <w:b/>
+          <w:color w:val="C56A4D"/>
+        </w:rPr>
+        <w:t xml:space="preserve">Example: </w:t>
+      </w:r>
+      <w:r>
+        <w:rPr>
+          <w:i/>
+          <w:color w:val="64735B"/>
+        </w:rPr>
+        <w:t>Can pause, stay curious, make a thoughtful choice, repair when needed, and use support.</w:t>
+      </w:r>
+    </w:p>
+    <w:p>
+      <w:pPr>
+        <w:keepNext/>
+        <w:spacing w:before="160" w:after="40"/>
+      </w:pPr>
+      <w:r>
+        <w:rPr>
+          <w:b/>
+          <w:color w:val="2A3C2F"/>
+        </w:rPr>
+        <w:t>05  The moment I feel least confident</w:t>
+      </w:r>
+    </w:p>
+    <w:p>
+      <w:pPr>
+        <w:spacing w:after="100"/>
+        <w:ind w:left="403"/>
+      </w:pPr>
+      <w:r>
+        <w:rPr>
+          <w:b/>
+          <w:color w:val="C56A4D"/>
+        </w:rPr>
+        <w:t xml:space="preserve">Example: </w:t>
+      </w:r>
+      <w:r>
+        <w:rPr>
+          <w:i/>
+          <w:color w:val="64735B"/>
+        </w:rPr>
+        <w:t>When a client becomes quiet and I cannot tell whether they need space, a question, or a change in direction.</w:t>
+      </w:r>
+    </w:p>
+    <w:p>
+      <w:pPr>
+        <w:keepNext/>
+        <w:spacing w:before="160" w:after="40"/>
+      </w:pPr>
+      <w:r>
+        <w:rPr>
+          <w:b/>
+          <w:color w:val="2A3C2F"/>
+        </w:rPr>
+        <w:t>06  When that happens, I tend to…</w:t>
+      </w:r>
+    </w:p>
+    <w:p>
+      <w:pPr>
+        <w:spacing w:after="100"/>
+        <w:ind w:left="403"/>
+      </w:pPr>
+      <w:r>
+        <w:rPr>
+          <w:b/>
+          <w:color w:val="C56A4D"/>
+        </w:rPr>
+        <w:t xml:space="preserve">Example: </w:t>
+      </w:r>
+      <w:r>
+        <w:rPr>
+          <w:i/>
+          <w:color w:val="64735B"/>
+        </w:rPr>
+        <w:t>I ask too many questions, explain more than necessary, and replay the session afterward.</w:t>
+      </w:r>
+    </w:p>
+    <w:p>
+      <w:pPr>
+        <w:keepNext/>
+        <w:spacing w:before="160" w:after="40"/>
+      </w:pPr>
+      <w:r>
+        <w:rPr>
+          <w:b/>
+          <w:color w:val="2A3C2F"/>
+        </w:rPr>
+        <w:t>07  The clinical skill I most want to strengthen</w:t>
+      </w:r>
+    </w:p>
+    <w:p>
+      <w:pPr>
+        <w:spacing w:after="100"/>
+        <w:ind w:left="403"/>
+      </w:pPr>
+      <w:r>
+        <w:rPr>
+          <w:b/>
+          <w:color w:val="C56A4D"/>
+        </w:rPr>
+        <w:t xml:space="preserve">Example: </w:t>
+      </w:r>
+      <w:r>
+        <w:rPr>
+          <w:i/>
+          <w:color w:val="64735B"/>
+        </w:rPr>
+        <w:t>Helping a client move from describing events into exploring the feeling or meaning underneath.</w:t>
+      </w:r>
+    </w:p>
+    <w:p>
+      <w:pPr>
+        <w:keepNext/>
+        <w:spacing w:before="160" w:after="40"/>
+      </w:pPr>
+      <w:r>
+        <w:rPr>
+          <w:b/>
+          <w:color w:val="2A3C2F"/>
+        </w:rPr>
+        <w:t>08  The confidence behavior I want to practice</w:t>
+      </w:r>
+    </w:p>
+    <w:p>
+      <w:pPr>
+        <w:spacing w:after="100"/>
+        <w:ind w:left="403"/>
+      </w:pPr>
+      <w:r>
+        <w:rPr>
+          <w:b/>
+          <w:color w:val="C56A4D"/>
+        </w:rPr>
+        <w:t xml:space="preserve">Example: </w:t>
+      </w:r>
+      <w:r>
+        <w:rPr>
+          <w:i/>
+          <w:color w:val="64735B"/>
+        </w:rPr>
+        <w:t>Pause for one breath and reflect what I heard before asking another question.</w:t>
+      </w:r>
+    </w:p>
+    <w:p>
+      <w:pPr>
+        <w:keepNext/>
+        <w:spacing w:before="160" w:after="40"/>
+      </w:pPr>
+      <w:r>
+        <w:rPr>
+          <w:b/>
+          <w:color w:val="2A3C2F"/>
+        </w:rPr>
+        <w:t>09  Evidence I want after four weeks</w:t>
+      </w:r>
+    </w:p>
+    <w:p>
+      <w:pPr>
+        <w:spacing w:after="100"/>
+        <w:ind w:left="403"/>
+      </w:pPr>
+      <w:r>
+        <w:rPr>
+          <w:b/>
+          <w:color w:val="C56A4D"/>
+        </w:rPr>
+        <w:t xml:space="preserve">Example: </w:t>
+      </w:r>
+      <w:r>
+        <w:rPr>
+          <w:i/>
+          <w:color w:val="64735B"/>
+        </w:rPr>
+        <w:t>I can notice my urge to perform and choose one grounded next move instead.</w:t>
+      </w:r>
+    </w:p>
+    <w:p>
+      <w:pPr>
+        <w:keepNext/>
+        <w:spacing w:before="160" w:after="40"/>
+      </w:pPr>
+      <w:r>
+        <w:rPr>
+          <w:b/>
+          <w:color w:val="2A3C2F"/>
+        </w:rPr>
+        <w:t>10  Knowledge or skill need</w:t>
+      </w:r>
+    </w:p>
+    <w:p>
+      <w:pPr>
+        <w:spacing w:after="100"/>
+        <w:ind w:left="403"/>
+      </w:pPr>
+      <w:r>
+        <w:rPr>
+          <w:b/>
+          <w:color w:val="C56A4D"/>
+        </w:rPr>
+        <w:t xml:space="preserve">Example: </w:t>
+      </w:r>
+      <w:r>
+        <w:rPr>
+          <w:i/>
+          <w:color w:val="64735B"/>
+        </w:rPr>
+        <w:t>I know the concept of emotional reflection, but I need clearer language for using it naturally in the room.</w:t>
+      </w:r>
+    </w:p>
+    <w:p>
+      <w:pPr>
+        <w:keepNext/>
+        <w:spacing w:before="160" w:after="40"/>
+      </w:pPr>
+      <w:r>
+        <w:rPr>
+          <w:b/>
+          <w:color w:val="2A3C2F"/>
+        </w:rPr>
+        <w:t>11  Practice or repetition need</w:t>
+      </w:r>
+    </w:p>
+    <w:p>
+      <w:pPr>
+        <w:spacing w:after="100"/>
+        <w:ind w:left="403"/>
+      </w:pPr>
+      <w:r>
+        <w:rPr>
+          <w:b/>
+          <w:color w:val="C56A4D"/>
+        </w:rPr>
+        <w:t xml:space="preserve">Example: </w:t>
+      </w:r>
+      <w:r>
+        <w:rPr>
+          <w:i/>
+          <w:color w:val="64735B"/>
+        </w:rPr>
+        <w:t>I have tried collaborative focusing only a few times, so it disappears when I feel pressured.</w:t>
+      </w:r>
+    </w:p>
+    <w:p>
+      <w:pPr>
+        <w:keepNext/>
+        <w:spacing w:before="160" w:after="40"/>
+      </w:pPr>
+      <w:r>
+        <w:rPr>
+          <w:b/>
+          <w:color w:val="2A3C2F"/>
+        </w:rPr>
+        <w:t>12  Clinical judgment need</w:t>
+      </w:r>
+    </w:p>
+    <w:p>
+      <w:pPr>
+        <w:spacing w:after="100"/>
+        <w:ind w:left="403"/>
+      </w:pPr>
+      <w:r>
+        <w:rPr>
+          <w:b/>
+          <w:color w:val="C56A4D"/>
+        </w:rPr>
+        <w:t xml:space="preserve">Example: </w:t>
+      </w:r>
+      <w:r>
+        <w:rPr>
+          <w:i/>
+          <w:color w:val="64735B"/>
+        </w:rPr>
+        <w:t>I can identify several possible directions but struggle to choose which matters most right now.</w:t>
+      </w:r>
+    </w:p>
+    <w:p>
+      <w:pPr>
+        <w:keepNext/>
+        <w:spacing w:before="160" w:after="40"/>
+      </w:pPr>
+      <w:r>
+        <w:rPr>
+          <w:b/>
+          <w:color w:val="2A3C2F"/>
+        </w:rPr>
+        <w:t>13  Confidence or activation need</w:t>
+      </w:r>
+    </w:p>
+    <w:p>
+      <w:pPr>
+        <w:spacing w:after="100"/>
+        <w:ind w:left="403"/>
+      </w:pPr>
+      <w:r>
+        <w:rPr>
+          <w:b/>
+          <w:color w:val="C56A4D"/>
+        </w:rPr>
+        <w:t xml:space="preserve">Example: </w:t>
+      </w:r>
+      <w:r>
+        <w:rPr>
+          <w:i/>
+          <w:color w:val="64735B"/>
+        </w:rPr>
+        <w:t>I know what I could do, but self-consciousness makes me rush and lose access to it.</w:t>
+      </w:r>
+    </w:p>
+    <w:p>
+      <w:pPr>
+        <w:keepNext/>
+        <w:spacing w:before="160" w:after="40"/>
+      </w:pPr>
+      <w:r>
+        <w:rPr>
+          <w:b/>
+          <w:color w:val="2A3C2F"/>
+        </w:rPr>
+        <w:t>14  Role or context need</w:t>
+      </w:r>
+    </w:p>
+    <w:p>
+      <w:pPr>
+        <w:spacing w:after="100"/>
+        <w:ind w:left="403"/>
+      </w:pPr>
+      <w:r>
+        <w:rPr>
+          <w:b/>
+          <w:color w:val="C56A4D"/>
+        </w:rPr>
+        <w:t xml:space="preserve">Example: </w:t>
+      </w:r>
+      <w:r>
+        <w:rPr>
+          <w:i/>
+          <w:color w:val="64735B"/>
+        </w:rPr>
+        <w:t>Back-to-back sessions and unclear expectations are making it harder to think and close on time.</w:t>
+      </w:r>
+    </w:p>
+    <w:p>
+      <w:pPr>
+        <w:keepNext/>
+        <w:spacing w:before="160" w:after="40"/>
+      </w:pPr>
+      <w:r>
+        <w:rPr>
+          <w:b/>
+          <w:color w:val="2A3C2F"/>
+        </w:rPr>
+        <w:t>15  Sustainability need</w:t>
+      </w:r>
+    </w:p>
+    <w:p>
+      <w:pPr>
+        <w:spacing w:after="100"/>
+        <w:ind w:left="403"/>
+      </w:pPr>
+      <w:r>
+        <w:rPr>
+          <w:b/>
+          <w:color w:val="C56A4D"/>
+        </w:rPr>
+        <w:t xml:space="preserve">Example: </w:t>
+      </w:r>
+      <w:r>
+        <w:rPr>
+          <w:i/>
+          <w:color w:val="64735B"/>
+        </w:rPr>
+        <w:t>I need a real transition after work instead of reviewing sessions throughout the evening.</w:t>
+      </w:r>
+    </w:p>
+    <w:p>
+      <w:pPr>
+        <w:keepNext/>
+        <w:spacing w:before="160" w:after="40"/>
+      </w:pPr>
+      <w:r>
+        <w:rPr>
+          <w:b/>
+          <w:color w:val="2A3C2F"/>
+        </w:rPr>
+        <w:t>16  The gap I am tempted to shame</w:t>
+      </w:r>
+    </w:p>
+    <w:p>
+      <w:pPr>
+        <w:spacing w:after="100"/>
+        <w:ind w:left="403"/>
+      </w:pPr>
+      <w:r>
+        <w:rPr>
+          <w:b/>
+          <w:color w:val="C56A4D"/>
+        </w:rPr>
+        <w:t xml:space="preserve">Example: </w:t>
+      </w:r>
+      <w:r>
+        <w:rPr>
+          <w:i/>
+          <w:color w:val="64735B"/>
+        </w:rPr>
+        <w:t>Needing more time to understand the thread when a client brings several concerns at once.</w:t>
+      </w:r>
+    </w:p>
+    <w:p>
+      <w:pPr>
+        <w:keepNext/>
+        <w:spacing w:before="160" w:after="40"/>
+      </w:pPr>
+      <w:r>
+        <w:rPr>
+          <w:b/>
+          <w:color w:val="2A3C2F"/>
+        </w:rPr>
+        <w:t>17  A more accurate description</w:t>
+      </w:r>
+    </w:p>
+    <w:p>
+      <w:pPr>
+        <w:spacing w:after="100"/>
+        <w:ind w:left="403"/>
+      </w:pPr>
+      <w:r>
+        <w:rPr>
+          <w:b/>
+          <w:color w:val="C56A4D"/>
+        </w:rPr>
+        <w:t xml:space="preserve">Example: </w:t>
+      </w:r>
+      <w:r>
+        <w:rPr>
+          <w:i/>
+          <w:color w:val="64735B"/>
+        </w:rPr>
+        <w:t>I am still building prioritization through repetition; this is a practice need, not proof that I am incapable.</w:t>
+      </w:r>
+    </w:p>
+    <w:p>
+      <w:pPr>
+        <w:keepNext/>
+        <w:spacing w:before="160" w:after="40"/>
+      </w:pPr>
+      <w:r>
+        <w:rPr>
+          <w:b/>
+          <w:color w:val="2A3C2F"/>
+        </w:rPr>
+        <w:t>18  A responsible practice step</w:t>
+      </w:r>
+    </w:p>
+    <w:p>
+      <w:pPr>
+        <w:spacing w:after="100"/>
+        <w:ind w:left="403"/>
+      </w:pPr>
+      <w:r>
+        <w:rPr>
+          <w:b/>
+          <w:color w:val="C56A4D"/>
+        </w:rPr>
+        <w:t xml:space="preserve">Example: </w:t>
+      </w:r>
+      <w:r>
+        <w:rPr>
+          <w:i/>
+          <w:color w:val="64735B"/>
+        </w:rPr>
+        <w:t>Use CLEAR on one de-identified example and bring my reasoning to supervision.</w:t>
+      </w:r>
+    </w:p>
+    <w:p>
+      <w:pPr>
+        <w:keepNext/>
+        <w:spacing w:before="160" w:after="40"/>
+      </w:pPr>
+      <w:r>
+        <w:rPr>
+          <w:b/>
+          <w:color w:val="2A3C2F"/>
+        </w:rPr>
+        <w:t>19  Activation pattern 1</w:t>
+      </w:r>
+    </w:p>
+    <w:p>
+      <w:pPr>
+        <w:spacing w:after="100"/>
+        <w:ind w:left="403"/>
+      </w:pPr>
+      <w:r>
+        <w:rPr>
+          <w:b/>
+          <w:color w:val="C56A4D"/>
+        </w:rPr>
+        <w:t xml:space="preserve">Example: </w:t>
+      </w:r>
+      <w:r>
+        <w:rPr>
+          <w:i/>
+          <w:color w:val="64735B"/>
+        </w:rPr>
+        <w:t>Overexplaining — trigger: silence; what I do: teach too quickly; cost: I stop listening for the client’s meaning.</w:t>
+      </w:r>
+    </w:p>
+    <w:p>
+      <w:pPr>
+        <w:keepNext/>
+        <w:spacing w:before="160" w:after="40"/>
+      </w:pPr>
+      <w:r>
+        <w:rPr>
+          <w:b/>
+          <w:color w:val="2A3C2F"/>
+        </w:rPr>
+        <w:t>20  Activation pattern 2</w:t>
+      </w:r>
+    </w:p>
+    <w:p>
+      <w:pPr>
+        <w:spacing w:after="100"/>
+        <w:ind w:left="403"/>
+      </w:pPr>
+      <w:r>
+        <w:rPr>
+          <w:b/>
+          <w:color w:val="C56A4D"/>
+        </w:rPr>
+        <w:t xml:space="preserve">Example: </w:t>
+      </w:r>
+      <w:r>
+        <w:rPr>
+          <w:i/>
+          <w:color w:val="64735B"/>
+        </w:rPr>
+        <w:t>Disappearing — trigger: possible disagreement; what I do: avoid redirecting; cost: the session loses direction.</w:t>
+      </w:r>
+    </w:p>
+    <w:p>
+      <w:pPr>
+        <w:keepNext/>
+        <w:spacing w:before="160" w:after="40"/>
+      </w:pPr>
+      <w:r>
+        <w:rPr>
+          <w:b/>
+          <w:color w:val="2A3C2F"/>
+        </w:rPr>
+        <w:t>21  The helpful-looking anxiety pattern</w:t>
+      </w:r>
+    </w:p>
+    <w:p>
+      <w:pPr>
+        <w:spacing w:after="100"/>
+        <w:ind w:left="403"/>
+      </w:pPr>
+      <w:r>
+        <w:rPr>
+          <w:b/>
+          <w:color w:val="C56A4D"/>
+        </w:rPr>
+        <w:t xml:space="preserve">Example: </w:t>
+      </w:r>
+      <w:r>
+        <w:rPr>
+          <w:i/>
+          <w:color w:val="64735B"/>
+        </w:rPr>
+        <w:t>Rescuing, because extra reassurance looks caring even when I am trying to make my own anxiety stop.</w:t>
+      </w:r>
+    </w:p>
+    <w:p>
+      <w:pPr>
+        <w:keepNext/>
+        <w:spacing w:before="160" w:after="40"/>
+      </w:pPr>
+      <w:r>
+        <w:rPr>
+          <w:b/>
+          <w:color w:val="2A3C2F"/>
+        </w:rPr>
+        <w:t>22  The earliest body cue</w:t>
+      </w:r>
+    </w:p>
+    <w:p>
+      <w:pPr>
+        <w:spacing w:after="100"/>
+        <w:ind w:left="403"/>
+      </w:pPr>
+      <w:r>
+        <w:rPr>
+          <w:b/>
+          <w:color w:val="C56A4D"/>
+        </w:rPr>
+        <w:t xml:space="preserve">Example: </w:t>
+      </w:r>
+      <w:r>
+        <w:rPr>
+          <w:i/>
+          <w:color w:val="64735B"/>
+        </w:rPr>
+        <w:t>My jaw tightens and I lean forward as if I need to make something happen immediately.</w:t>
+      </w:r>
+    </w:p>
+    <w:p>
+      <w:pPr>
+        <w:keepNext/>
+        <w:spacing w:before="160" w:after="40"/>
+      </w:pPr>
+      <w:r>
+        <w:rPr>
+          <w:b/>
+          <w:color w:val="2A3C2F"/>
+        </w:rPr>
+        <w:t>23  The pause I can practice</w:t>
+      </w:r>
+    </w:p>
+    <w:p>
+      <w:pPr>
+        <w:spacing w:after="100"/>
+        <w:ind w:left="403"/>
+      </w:pPr>
+      <w:r>
+        <w:rPr>
+          <w:b/>
+          <w:color w:val="C56A4D"/>
+        </w:rPr>
+        <w:t xml:space="preserve">Example: </w:t>
+      </w:r>
+      <w:r>
+        <w:rPr>
+          <w:i/>
+          <w:color w:val="64735B"/>
+        </w:rPr>
+        <w:t>Put both feet on the floor, exhale, and silently ask, “What do I actually know?”</w:t>
+      </w:r>
+    </w:p>
+    <w:p>
+      <w:pPr>
+        <w:keepNext/>
+        <w:spacing w:before="160" w:after="40"/>
+      </w:pPr>
+      <w:r>
+        <w:rPr>
+          <w:b/>
+          <w:color w:val="2A3C2F"/>
+        </w:rPr>
+        <w:t>24  What happened before confidence dropped</w:t>
+      </w:r>
+    </w:p>
+    <w:p>
+      <w:pPr>
+        <w:spacing w:after="100"/>
+        <w:ind w:left="403"/>
+      </w:pPr>
+      <w:r>
+        <w:rPr>
+          <w:b/>
+          <w:color w:val="C56A4D"/>
+        </w:rPr>
+        <w:t xml:space="preserve">Example: </w:t>
+      </w:r>
+      <w:r>
+        <w:rPr>
+          <w:i/>
+          <w:color w:val="64735B"/>
+        </w:rPr>
+        <w:t>The client answered two questions with “I don’t know” and looked toward the floor.</w:t>
+      </w:r>
+    </w:p>
+    <w:p>
+      <w:pPr>
+        <w:keepNext/>
+        <w:spacing w:before="160" w:after="40"/>
+      </w:pPr>
+      <w:r>
+        <w:rPr>
+          <w:b/>
+          <w:color w:val="2A3C2F"/>
+        </w:rPr>
+        <w:t>25  Known or observable facts</w:t>
       </w:r>
     </w:p>
     <w:p>
@@ -113,7 +905,7 @@
           <w:b/>
           <w:color w:val="2A3C2F"/>
         </w:rPr>
-        <w:t>02  The story or assumption my brain created</w:t>
+        <w:t>26  The story or assumption my brain created</w:t>
       </w:r>
     </w:p>
     <w:p>
@@ -146,7 +938,7 @@
           <w:b/>
           <w:color w:val="2A3C2F"/>
         </w:rPr>
-        <w:t>03  Body cues and activation</w:t>
+        <w:t>27  Body cues and activation</w:t>
       </w:r>
     </w:p>
     <w:p>
@@ -179,7 +971,7 @@
           <w:b/>
           <w:color w:val="2A3C2F"/>
         </w:rPr>
-        <w:t>04  Protective patterns</w:t>
+        <w:t>28  Protective patterns</w:t>
       </w:r>
     </w:p>
     <w:p>
@@ -212,7 +1004,7 @@
           <w:b/>
           <w:color w:val="2A3C2F"/>
         </w:rPr>
-        <w:t>05  Skill or training gaps</w:t>
+        <w:t>29  Skill or training gaps</w:t>
       </w:r>
     </w:p>
     <w:p>
@@ -245,7 +1037,7 @@
           <w:b/>
           <w:color w:val="2A3C2F"/>
         </w:rPr>
-        <w:t>06  Support or consultation</w:t>
+        <w:t>30  Support or consultation</w:t>
       </w:r>
     </w:p>
     <w:p>
@@ -278,7 +1070,7 @@
           <w:b/>
           <w:color w:val="2A3C2F"/>
         </w:rPr>
-        <w:t>07  Defining a confident clinician</w:t>
+        <w:t>31  Defining a confident clinician</w:t>
       </w:r>
     </w:p>
     <w:p>
@@ -311,7 +1103,7 @@
           <w:b/>
           <w:color w:val="2A3C2F"/>
         </w:rPr>
-        <w:t>08  Behavior experiment</w:t>
+        <w:t>32  Behavior experiment</w:t>
       </w:r>
     </w:p>
     <w:p>
@@ -344,7 +1136,7 @@
           <w:b/>
           <w:color w:val="2A3C2F"/>
         </w:rPr>
-        <w:t>09  Clinical thread</w:t>
+        <w:t>33  Clinical thread</w:t>
       </w:r>
     </w:p>
     <w:p>
@@ -377,7 +1169,7 @@
           <w:b/>
           <w:color w:val="2A3C2F"/>
         </w:rPr>
-        <w:t>10  Grounded response or next move</w:t>
+        <w:t>34  Grounded response or next move</w:t>
       </w:r>
     </w:p>
     <w:p>
@@ -410,7 +1202,7 @@
           <w:b/>
           <w:color w:val="2A3C2F"/>
         </w:rPr>
-        <w:t>11  Priority</w:t>
+        <w:t>35  Priority</w:t>
       </w:r>
     </w:p>
     <w:p>
@@ -443,7 +1235,7 @@
           <w:b/>
           <w:color w:val="2A3C2F"/>
         </w:rPr>
-        <w:t>12  Role reminder</w:t>
+        <w:t>36  Role reminder</w:t>
       </w:r>
     </w:p>
     <w:p>
@@ -476,7 +1268,7 @@
           <w:b/>
           <w:color w:val="2A3C2F"/>
         </w:rPr>
-        <w:t>13  What I can release</w:t>
+        <w:t>37  What I can release</w:t>
       </w:r>
     </w:p>
     <w:p>
@@ -509,7 +1301,7 @@
           <w:b/>
           <w:color w:val="2A3C2F"/>
         </w:rPr>
-        <w:t>14  What I might try differently</w:t>
+        <w:t>38  What I might try differently</w:t>
       </w:r>
     </w:p>
     <w:p>
@@ -542,7 +1334,7 @@
           <w:b/>
           <w:color w:val="2A3C2F"/>
         </w:rPr>
-        <w:t>15  What happened</w:t>
+        <w:t>39  What happened</w:t>
       </w:r>
     </w:p>
     <w:p>
@@ -575,7 +1367,7 @@
           <w:b/>
           <w:color w:val="2A3C2F"/>
         </w:rPr>
-        <w:t>16  Closing or ending language</w:t>
+        <w:t>40  Closing or ending language</w:t>
       </w:r>
     </w:p>
     <w:p>
@@ -608,7 +1400,7 @@
           <w:b/>
           <w:color w:val="2A3C2F"/>
         </w:rPr>
-        <w:t>17  Clinical value in behavior</w:t>
+        <w:t>41  Clinical value in behavior</w:t>
       </w:r>
     </w:p>
     <w:p>
@@ -641,7 +1433,7 @@
           <w:b/>
           <w:color w:val="2A3C2F"/>
         </w:rPr>
-        <w:t>18  Boundary</w:t>
+        <w:t>42  Boundary</w:t>
       </w:r>
     </w:p>
     <w:p>
@@ -674,7 +1466,7 @@
           <w:b/>
           <w:color w:val="2A3C2F"/>
         </w:rPr>
-        <w:t>19  Evidence of growth</w:t>
+        <w:t>43  Evidence of growth</w:t>
       </w:r>
     </w:p>
     <w:p>
@@ -707,7 +1499,7 @@
           <w:b/>
           <w:color w:val="2A3C2F"/>
         </w:rPr>
-        <w:t>20  30-day or weekly commitment</w:t>
+        <w:t>44  30-day or weekly commitment</w:t>
       </w:r>
     </w:p>
     <w:p>
@@ -740,7 +1532,7 @@
           <w:b/>
           <w:color w:val="2A3C2F"/>
         </w:rPr>
-        <w:t>21  Open-ended reflection</w:t>
+        <w:t>45  Open-ended reflection</w:t>
       </w:r>
     </w:p>
     <w:p>

</xml_diff>